<commit_message>
feat: cadastra culturas e sincroniza salario
</commit_message>
<xml_diff>
--- a/Proximas implementações no projeto.docx
+++ b/Proximas implementações no projeto.docx
@@ -4,52 +4,31 @@
   <w:body>
     <w:p>
       <w:r>
-        <w:t>Dentro do cadastro do colaborador, criar abas, Salário e Férias.</w:t>
+        <w:t>No meu projeto Folha Rural, que está em d:\app Folha Rural</w:t>
       </w:r>
     </w:p>
     <w:p>
       <w:r>
-        <w:t xml:space="preserve">Na aba Salário: Vinculo, pesquisar pelo padrão usado na folha IOB, com caixa de seleção do vínculo; Tipo de Contrato, com caixa </w:t>
+        <w:t xml:space="preserve">Gostaria que </w:t>
+      </w:r>
+      <w:r>
+        <w:t xml:space="preserve">ao clicar em gestão agrícola, a opção estoques custos, fossem </w:t>
+      </w:r>
+      <w:proofErr w:type="gramStart"/>
+      <w:r>
+        <w:t>exibido</w:t>
+      </w:r>
+      <w:proofErr w:type="gramEnd"/>
+      <w:r>
+        <w:t xml:space="preserve"> sem abas na </w:t>
       </w:r>
       <w:proofErr w:type="spellStart"/>
       <w:r>
-        <w:t>dde</w:t>
+        <w:t>vertival</w:t>
       </w:r>
       <w:proofErr w:type="spellEnd"/>
       <w:r>
-        <w:t xml:space="preserve"> seleção: Prazo Determinado e Prazo Indeterminado; Tipo de salário: Mensalista (usará o salário mensal como </w:t>
-      </w:r>
-      <w:proofErr w:type="spellStart"/>
-      <w:r>
-        <w:t>referencia</w:t>
-      </w:r>
-      <w:proofErr w:type="spellEnd"/>
-      <w:r>
-        <w:t xml:space="preserve">, se a folha for gerada na quinzena, irá gerar adiantamento de 40% do salário e na folha </w:t>
-      </w:r>
-      <w:proofErr w:type="spellStart"/>
-      <w:r>
-        <w:t>mensão</w:t>
-      </w:r>
-      <w:proofErr w:type="spellEnd"/>
-      <w:r>
-        <w:t xml:space="preserve">, irá gerar o salário integral, realizando os lançamentos obrigatórios, salário família, </w:t>
-      </w:r>
-      <w:proofErr w:type="spellStart"/>
-      <w:r>
-        <w:t>inss</w:t>
-      </w:r>
-      <w:proofErr w:type="spellEnd"/>
-      <w:r>
-        <w:t xml:space="preserve">, </w:t>
-      </w:r>
-      <w:proofErr w:type="spellStart"/>
-      <w:r>
-        <w:t>irpf</w:t>
-      </w:r>
-      <w:proofErr w:type="spellEnd"/>
-      <w:r>
-        <w:t xml:space="preserve"> e </w:t>
+        <w:t xml:space="preserve">, com cadastros e </w:t>
       </w:r>
       <w:proofErr w:type="spellStart"/>
       <w:r>
@@ -57,103 +36,20 @@
       </w:r>
       <w:proofErr w:type="spellEnd"/>
       <w:r>
-        <w:t>), se Apontamento diário, considerar o apontamento da planilha diária, que pode haver produção, onde o valor da diária, será 1/30 do salario base cadastrado, com flexibilidade para ser alterado) com caixa de seleção para Mensalista e Apontamento Diário.</w:t>
-      </w:r>
-    </w:p>
-    <w:p>
-      <w:r>
-        <w:t xml:space="preserve">Na aba férias: </w:t>
+        <w:t xml:space="preserve">, igualmente existe na folha, com separação de </w:t>
       </w:r>
       <w:proofErr w:type="gramStart"/>
       <w:r>
-        <w:t>criar  campos</w:t>
+        <w:t>relatórios  e</w:t>
       </w:r>
       <w:proofErr w:type="gramEnd"/>
       <w:r>
-        <w:t xml:space="preserve"> padrão, necessários para o gerenciamento das férias. Criar alerta para quando o colaborador tiver férias vencidas e restando quatro meses para dobrar as férias, que haja lembrete para programar as férias, lembrete que persistirá até o cadastro para quitação da </w:t>
+        <w:t xml:space="preserve"> etc. para que fique funcional e intuitivo com organização e estrutura profissional</w:t>
       </w:r>
-      <w:proofErr w:type="gramStart"/>
       <w:r>
-        <w:t>primeira férias</w:t>
-      </w:r>
-      <w:proofErr w:type="gramEnd"/>
-      <w:r>
-        <w:t xml:space="preserve"> para não dobrar;</w:t>
+        <w:t xml:space="preserve"> </w:t>
       </w:r>
     </w:p>
-    <w:p>
-      <w:r>
-        <w:t>Criar aba de Evolução Salarial, onde criaremos duas opções, uma para registro do Salário Mínimo Nacional</w:t>
-      </w:r>
-      <w:r>
-        <w:t xml:space="preserve"> e outra para o </w:t>
-      </w:r>
-      <w:proofErr w:type="gramStart"/>
-      <w:r>
-        <w:t>Salario</w:t>
-      </w:r>
-      <w:proofErr w:type="gramEnd"/>
-      <w:r>
-        <w:t xml:space="preserve"> da Categoria, onde em dentro da aba principal de Evolução salarial, as abas filhas e independentes, terão campos para informar, Data do Reajuste, Valor e um campo para observação, para se for o caso de registrar alguma particularidade. Criar também um filtro para listar o histórico de registro, caso seja necessário, com campos de dia, mês e ano inicial e final;</w:t>
-      </w:r>
-    </w:p>
-    <w:p>
-      <w:r>
-        <w:t xml:space="preserve">Criar uma nova hierarquia com Aba Cadastros, onde ficarão vinculadas: Empresas, colaboradores, serviços, Apontamentos, sindicatos, criar também nessa hierarquia as abas: Função, onde teremos o campo CBO, que poderá ser informado por código ou descrição da atividade e fará busca oficial com opção inserir uma descrição associada a função </w:t>
-      </w:r>
-      <w:proofErr w:type="spellStart"/>
-      <w:r>
-        <w:t>ofialmente</w:t>
-      </w:r>
-      <w:proofErr w:type="spellEnd"/>
-      <w:r>
-        <w:t xml:space="preserve"> apresentada e botão salvar, editar e excluir (se não houver vinculo de trabalhadores cadastrados), esse campo, passara a ser o oficial para seleção da função no cadastro do trabalhador. Ainda dentro da aba principal cadastro, criar aba, reajuste salarial, </w:t>
-      </w:r>
-      <w:r>
-        <w:t>onde o reajuste através dessa aba será para colaboradores ativos, com os campos: Caixa de seleção para definir se todas ou algumas funções cadastradas</w:t>
-      </w:r>
-      <w:r>
-        <w:t xml:space="preserve"> serão contempladas com </w:t>
-      </w:r>
-      <w:r>
-        <w:t xml:space="preserve">o Reajuste,  </w:t>
-      </w:r>
-      <w:r>
-        <w:t>na sequencia o campo para inserir Data do Reajuste</w:t>
-      </w:r>
-      <w:r>
-        <w:t xml:space="preserve">, caixa de seleção para escolha se será informado novo valor do salário ou índice de reajuste, se novo salário, será considerado o valor informado, se percentual, aplicar sobre o salário registrado conforme o filtro, um campo para observação do motivo do reajuste e listar na tela após confirmar o reajuste, na sequencia uma segunda confirmação se pode atualizar no cadastro do colaborador, se sim, atualizar inserindo os campos específicos na aba de salario do trabalhador, mantendo o histórico de data, valor e motivo do reajuste. Criar opção também de desfazer reajuste, onde será informado a data do reajuste com campos de filtros idênticos e também visualizar em tela e só excluir após confirmação; ainda na hierarquia da aba cadastros, criar </w:t>
-      </w:r>
-      <w:r>
-        <w:lastRenderedPageBreak/>
-        <w:t xml:space="preserve">Centro de Custo, onde serão criados código automático que não precisão ser exibidos, Descrição e data da criação, esse centro de custo estará vinculado diretamente ao cadastro do serviço, onde aparecerá a caixa de seleção no campo Grupo, que deverá ser renomeado para Centro de Custo, esses centro de custo servirão para geração de relatórios aprimorados para uma análise gerencial. Ainda na mesma hierarquia do cadastro, agora vamos criar EPI e dentro de EPI, as opções de Cadastro e Fornecimento, onde para Cadastro, vamos criar </w:t>
-      </w:r>
-      <w:proofErr w:type="spellStart"/>
-      <w:r>
-        <w:t>Codigo</w:t>
-      </w:r>
-      <w:proofErr w:type="spellEnd"/>
-      <w:r>
-        <w:t xml:space="preserve">, que será automático, Descrição, Fornecedor e CA, todos campos para serem preenchidos, se possível, aprimorar com fichas de EPI usadas por empresas, bem como incluir na opção de Fornecimento modelos usados por empresas de </w:t>
-      </w:r>
-      <w:proofErr w:type="spellStart"/>
-      <w:r>
-        <w:t>referencia</w:t>
-      </w:r>
-      <w:proofErr w:type="spellEnd"/>
-      <w:r>
-        <w:t xml:space="preserve"> na área rural. Ainda na hierarquia de criar, vamos inserir a aba </w:t>
-      </w:r>
-      <w:proofErr w:type="spellStart"/>
-      <w:r>
-        <w:t>Ferremanentas</w:t>
-      </w:r>
-      <w:proofErr w:type="spellEnd"/>
-      <w:r>
-        <w:t>, com as opções semelhantes ao de EPI com Cadastro e fornecimento, obviamente, obedecendo suas características.</w:t>
-      </w:r>
-    </w:p>
-    <w:p/>
     <w:sectPr>
       <w:pgSz w:w="11906" w:h="16838"/>
       <w:pgMar w:top="1417" w:right="1701" w:bottom="1417" w:left="1701" w:header="708" w:footer="708" w:gutter="0"/>

</xml_diff>

<commit_message>
Sincroniza alteracoes pendentes v1.4.46
</commit_message>
<xml_diff>
--- a/Proximas implementações no projeto.docx
+++ b/Proximas implementações no projeto.docx
@@ -9,45 +9,131 @@
     </w:p>
     <w:p>
       <w:r>
-        <w:t xml:space="preserve">Gostaria que </w:t>
-      </w:r>
-      <w:r>
-        <w:t xml:space="preserve">ao clicar em gestão agrícola, a opção estoques custos, fossem </w:t>
-      </w:r>
-      <w:proofErr w:type="gramStart"/>
-      <w:r>
-        <w:t>exibido</w:t>
-      </w:r>
-      <w:proofErr w:type="gramEnd"/>
-      <w:r>
-        <w:t xml:space="preserve"> sem abas na </w:t>
+        <w:t xml:space="preserve">Na aba Gerar tributos, ajustar para que elimine a barra de rolagem horizontal. Revisar o valor do </w:t>
       </w:r>
       <w:proofErr w:type="spellStart"/>
       <w:r>
-        <w:t>vertival</w:t>
+        <w:t>salario</w:t>
       </w:r>
       <w:proofErr w:type="spellEnd"/>
       <w:r>
-        <w:t xml:space="preserve">, com cadastros e </w:t>
+        <w:t xml:space="preserve"> bruto quando a folha for a do final do </w:t>
       </w:r>
       <w:proofErr w:type="spellStart"/>
       <w:r>
-        <w:t>etc</w:t>
+        <w:t>mÊs</w:t>
       </w:r>
       <w:proofErr w:type="spellEnd"/>
       <w:r>
-        <w:t xml:space="preserve">, igualmente existe na folha, com separação de </w:t>
-      </w:r>
-      <w:proofErr w:type="gramStart"/>
-      <w:r>
-        <w:t>relatórios  e</w:t>
-      </w:r>
-      <w:proofErr w:type="gramEnd"/>
-      <w:r>
-        <w:t xml:space="preserve"> etc. para que fique funcional e intuitivo com organização e estrutura profissional</w:t>
+        <w:t xml:space="preserve">, </w:t>
+      </w:r>
+      <w:r>
+        <w:t xml:space="preserve">ou seja, quando for final do </w:t>
+      </w:r>
+      <w:proofErr w:type="spellStart"/>
+      <w:r>
+        <w:t>mÊs</w:t>
+      </w:r>
+      <w:proofErr w:type="spellEnd"/>
+      <w:r>
+        <w:t xml:space="preserve">, observar se houve pagamento na 1 quinzena e lançar o valor bruto como desconto de adiantamento, já no </w:t>
+      </w:r>
+      <w:proofErr w:type="spellStart"/>
+      <w:r>
+        <w:t>inss</w:t>
+      </w:r>
+      <w:proofErr w:type="spellEnd"/>
+      <w:r>
+        <w:t xml:space="preserve"> e </w:t>
+      </w:r>
+      <w:proofErr w:type="spellStart"/>
+      <w:r>
+        <w:t>irpf</w:t>
+      </w:r>
+      <w:proofErr w:type="spellEnd"/>
+      <w:r>
+        <w:t>, apurar a contribuição sobre a remuneração total do mês e compensar o que já foi descontado na primeira quinzena, para que não haja um desconto duplicado e sempre revisar o cálculo automaticamente se alguma alteração for realizada nos lançamentos. Na aba Gestão agrícola, Criar sub aba, abaixo de entradas e saídas, Receitas, em caixa expandida na horizontal sem barra de rolagem, com cabeçalho: “Data, Cliente, que será caixa de seleção baseada nos clientes cadastrados, Quantidade, Preço e Valor</w:t>
+      </w:r>
+      <w:r>
+        <w:t xml:space="preserve">, onde os campos preço e valor ficam flexíveis, se informar quantidade e preço, calcula automaticamente o </w:t>
+      </w:r>
+      <w:proofErr w:type="spellStart"/>
+      <w:r>
+        <w:t>o</w:t>
+      </w:r>
+      <w:proofErr w:type="spellEnd"/>
+      <w:r>
+        <w:t xml:space="preserve"> valor, que será quantidade x preço, se informar quantidade e valor, calcula automaticamente o preço, que será valor/quantidade, no rodapé do relatório exibe os totais dos lançamentos. Permitir edição e exclusão das linhas digitadas. Inserir também filtro para consultas, com data inicial e data final, no formato </w:t>
+      </w:r>
+      <w:proofErr w:type="spellStart"/>
+      <w:r>
+        <w:t>dd</w:t>
+      </w:r>
+      <w:proofErr w:type="spellEnd"/>
+      <w:r>
+        <w:t>/mm/</w:t>
+      </w:r>
+      <w:proofErr w:type="spellStart"/>
+      <w:r>
+        <w:t>aaaa</w:t>
+      </w:r>
+      <w:proofErr w:type="spellEnd"/>
+      <w:r>
+        <w:t xml:space="preserve">. No </w:t>
+      </w:r>
+      <w:r>
+        <w:t>cadastro de clientes e fornecedores, usar o mesmo modelo da aba entradas e saídas, ou seja, usa a caixa expandida na horizontal exibindo primeiro os dados já cadastrados e abaixo tamb</w:t>
+      </w:r>
+      <w:r>
+        <w:t>é</w:t>
+      </w:r>
+      <w:r>
+        <w:t>m expandida a caixa para novo cadastro. Na aba entradas e saídas,</w:t>
+      </w:r>
+      <w:r>
+        <w:t xml:space="preserve"> na caixa e seleção tipo de movimentação:</w:t>
+      </w:r>
+      <w:r>
+        <w:t xml:space="preserve"> renomear as caixas “compra/entrada, para Entrada”, </w:t>
+      </w:r>
+      <w:r>
+        <w:t xml:space="preserve">Venda/receita para Saída, excluir opção consumo na lavoura” Na caixa de </w:t>
+      </w:r>
+      <w:proofErr w:type="spellStart"/>
+      <w:r>
+        <w:t>seleleção</w:t>
+      </w:r>
+      <w:proofErr w:type="spellEnd"/>
+      <w:r>
+        <w:t xml:space="preserve"> produtos, vincular ao cadastro de produtos e insumos. Na caixa Cliente ou Fornecedor vincular ao cadastro de clientes e fornecedores. A caixa data, mudar ordem, para que seja a primeira informação a ser inserida. Se o tipo de movimentação for Saída, não exibir as caixas de preço e valor e inserir a caixa estoque, que será o saldo das entradas – as </w:t>
+      </w:r>
+      <w:proofErr w:type="spellStart"/>
+      <w:r>
+        <w:t>saídas.excluir</w:t>
+      </w:r>
+      <w:proofErr w:type="spellEnd"/>
+      <w:r>
+        <w:t xml:space="preserve"> a caixa talhão/centro de custo. </w:t>
+      </w:r>
+      <w:r>
+        <w:t>Reposicionar a caixa documento para que fique após a data e cliente ou fornecedor que fique acima de produto.</w:t>
+      </w:r>
+      <w:r>
+        <w:t xml:space="preserve"> Separar o cadastro de Fornecedores e culturas para cada empresa, a </w:t>
       </w:r>
       <w:r>
         <w:t xml:space="preserve"> </w:t>
+      </w:r>
+      <w:r>
+        <w:t xml:space="preserve">exceção é para as empresas Ivaldo Alvim e Manoel </w:t>
+      </w:r>
+      <w:proofErr w:type="spellStart"/>
+      <w:r>
+        <w:t>Antonio</w:t>
+      </w:r>
+      <w:proofErr w:type="spellEnd"/>
+      <w:r>
+        <w:t xml:space="preserve"> que compartilham o mesmo cadastro.</w:t>
       </w:r>
     </w:p>
     <w:sectPr>

</xml_diff>